<commit_message>
Checkpoint: Added TF-IDF + Logistic Regression beside Naive Bayes, optimized benchmark runtime from 124 seconds to about 8 seconds for the full test suite, added an in-app project suggestions panel for gold labels, multi-video comparison, and limitation discussion, updated README and academic DOCX/PDF report, and verified Demo UI, 8 tests, TypeScript, and production build.
</commit_message>
<xml_diff>
--- a/reports/Marathi_YouTube_Sentiment_Emotion_Detection_Mini_Project_Report.docx
+++ b/reports/Marathi_YouTube_Sentiment_Emotion_Detection_Mini_Project_Report.docx
@@ -6802,7 +6802,7 @@
                 <w:i w:val="0"/>
                 <w:sz w:val="18"/>
               </w:rPr>
-              <w:t>TF-IDF + Multinomial Naive Bayes: 60% accuracy, precision, recall, and macro-F1 on the selected holdout sample.</w:t>
+              <w:t>TF-IDF + Multinomial Naive Bayes and TF-IDF + Logistic Regression are compared on the selected holdout sample using accuracy, precision, recall, and macro-F1.</w:t>
             </w:r>
           </w:p>
         </w:tc>
@@ -8162,7 +8162,7 @@
           <w:i w:val="0"/>
           <w:sz w:val="24"/>
         </w:rPr>
-        <w:t>The project also highlights important limitations. The live rule-based sentiment and emotion labels have not been validated against a manually annotated YouTube gold set. Marathi benchmark corpora are not identical to YouTube comments, and the distribution of emojis, spam, code-mixing, sarcasm, and very short replies can change the results. YouTube’s reported total may be larger than the accessible response because comments may be deleted, moderated, hidden, or unavailable to the API. A test-case checklist covers valid URLs, invalid URLs, disabled comments, replies, Roman Marathi, English text, and empty input. Future improvements include collecting and manually labelling 100–150 comments from multiple videos, adding MeSent for stronger code-mixed robustness, using the human-labelled splits of MahaEmotions for emotion evaluation, comparing a Marathi transformer model, and supporting cached multi-video trend analysis.</w:t>
+        <w:t>The project also highlights important limitations. The live rule-based sentiment and emotion labels have not been validated against a manually annotated YouTube gold set. Marathi benchmark corpora are not identical to YouTube comments, and the distribution of emojis, spam, code-mixing, sarcasm, and very short replies can change the results. YouTube’s reported total may be larger than the accessible response because comments may be deleted, moderated, hidden, or unavailable to the API. A test-case checklist covers valid URLs, invalid URLs, disabled comments, replies, Roman Marathi, English text, and empty input. The immediate recommended next steps are to annotate 100–150 comments, compare 3–5 videos, and discuss limitations in the final viva. Future improvements include adding MeSent for stronger code-mixed robustness, using the human-labelled splits of MahaEmotions for emotion evaluation, comparing a Marathi transformer model, and supporting cached multi-video trend analysis.</w:t>
       </w:r>
     </w:p>
     <w:p>

</xml_diff>